<commit_message>
wtf? que mudança isso ta contando?
</commit_message>
<xml_diff>
--- a/Relatorio.docx
+++ b/Relatorio.docx
@@ -13036,9 +13036,6 @@
       <w:pPr>
         <w:pStyle w:val="Legenda"/>
         <w:jc w:val="both"/>
-        <w:rPr>
-          <w:color w:val="0D0D0D" w:themeColor="text1" w:themeTint="F2"/>
-        </w:rPr>
       </w:pPr>
       <w:bookmarkStart w:id="62" w:name="_Toc233051124"/>
       <w:r>
@@ -13066,6 +13063,7 @@
       </w:r>
       <w:bookmarkEnd w:id="62"/>
     </w:p>
+    <w:p/>
     <w:p>
       <w:pPr>
         <w:pStyle w:val="Estilo-Paragrafos"/>
@@ -13593,9 +13591,9 @@
           <w:lang w:val="en-US"/>
         </w:rPr>
         <w:drawing>
-          <wp:inline distT="0" distB="0" distL="0" distR="0" wp14:anchorId="2E42E0C6" wp14:editId="56B5D7D5">
-            <wp:extent cx="5759280" cy="3122280"/>
-            <wp:effectExtent l="0" t="0" r="0" b="1920"/>
+          <wp:inline distT="0" distB="0" distL="0" distR="0" wp14:anchorId="2E42E0C6" wp14:editId="0E94A654">
+            <wp:extent cx="4728845" cy="3121270"/>
+            <wp:effectExtent l="0" t="0" r="0" b="3175"/>
             <wp:docPr id="413122526" name="Figura22"/>
             <wp:cNvGraphicFramePr/>
             <a:graphic xmlns:a="http://schemas.openxmlformats.org/drawingml/2006/main">
@@ -13605,28 +13603,32 @@
                     <pic:cNvPr id="0" name=""/>
                     <pic:cNvPicPr/>
                   </pic:nvPicPr>
-                  <pic:blipFill>
+                  <pic:blipFill rotWithShape="1">
                     <a:blip r:embed="rId29">
                       <a:lum/>
                       <a:alphaModFix/>
                     </a:blip>
-                    <a:srcRect/>
+                    <a:srcRect l="17866"/>
                     <a:stretch>
                       <a:fillRect/>
                     </a:stretch>
                   </pic:blipFill>
-                  <pic:spPr>
+                  <pic:spPr bwMode="auto">
                     <a:xfrm>
                       <a:off x="0" y="0"/>
-                      <a:ext cx="5759280" cy="3122280"/>
+                      <a:ext cx="4734087" cy="3124730"/>
                     </a:xfrm>
                     <a:prstGeom prst="rect">
                       <a:avLst/>
                     </a:prstGeom>
                     <a:ln>
                       <a:noFill/>
-                      <a:prstDash/>
                     </a:ln>
+                    <a:extLst>
+                      <a:ext uri="{53640926-AAD7-44D8-BBD7-CCE9431645EC}">
+                        <a14:shadowObscured xmlns:a14="http://schemas.microsoft.com/office/drawing/2010/main"/>
+                      </a:ext>
+                    </a:extLst>
                   </pic:spPr>
                 </pic:pic>
               </a:graphicData>
@@ -13639,9 +13641,6 @@
       <w:pPr>
         <w:pStyle w:val="Legenda"/>
         <w:jc w:val="both"/>
-        <w:rPr>
-          <w:color w:val="0D0D0D" w:themeColor="text1" w:themeTint="F2"/>
-        </w:rPr>
       </w:pPr>
       <w:bookmarkStart w:id="69" w:name="_Toc233051131"/>
       <w:r>
@@ -13660,6 +13659,95 @@
       </w:r>
       <w:bookmarkEnd w:id="69"/>
     </w:p>
+    <w:p/>
+    <w:p/>
+    <w:p/>
+    <w:p/>
+    <w:p/>
+    <w:p/>
+    <w:p>
+      <w:pPr>
+        <w:keepNext/>
+      </w:pPr>
+      <w:r>
+        <w:drawing>
+          <wp:inline distT="0" distB="0" distL="0" distR="0" wp14:anchorId="0CB1E5B3" wp14:editId="009D6E61">
+            <wp:extent cx="4467225" cy="2466975"/>
+            <wp:effectExtent l="0" t="0" r="9525" b="9525"/>
+            <wp:docPr id="610946519" name="Imagem 1"/>
+            <wp:cNvGraphicFramePr>
+              <a:graphicFrameLocks xmlns:a="http://schemas.openxmlformats.org/drawingml/2006/main" noChangeAspect="1"/>
+            </wp:cNvGraphicFramePr>
+            <a:graphic xmlns:a="http://schemas.openxmlformats.org/drawingml/2006/main">
+              <a:graphicData uri="http://schemas.openxmlformats.org/drawingml/2006/picture">
+                <pic:pic xmlns:pic="http://schemas.openxmlformats.org/drawingml/2006/picture">
+                  <pic:nvPicPr>
+                    <pic:cNvPr id="610946519" name=""/>
+                    <pic:cNvPicPr/>
+                  </pic:nvPicPr>
+                  <pic:blipFill rotWithShape="1">
+                    <a:blip r:embed="rId30"/>
+                    <a:srcRect l="14057" t="13527" r="8380" b="10313"/>
+                    <a:stretch>
+                      <a:fillRect/>
+                    </a:stretch>
+                  </pic:blipFill>
+                  <pic:spPr bwMode="auto">
+                    <a:xfrm>
+                      <a:off x="0" y="0"/>
+                      <a:ext cx="4467225" cy="2466975"/>
+                    </a:xfrm>
+                    <a:prstGeom prst="rect">
+                      <a:avLst/>
+                    </a:prstGeom>
+                    <a:ln>
+                      <a:noFill/>
+                    </a:ln>
+                    <a:extLst>
+                      <a:ext uri="{53640926-AAD7-44D8-BBD7-CCE9431645EC}">
+                        <a14:shadowObscured xmlns:a14="http://schemas.microsoft.com/office/drawing/2010/main"/>
+                      </a:ext>
+                    </a:extLst>
+                  </pic:spPr>
+                </pic:pic>
+              </a:graphicData>
+            </a:graphic>
+          </wp:inline>
+        </w:drawing>
+      </w:r>
+    </w:p>
+    <w:p>
+      <w:pPr>
+        <w:pStyle w:val="Legenda"/>
+      </w:pPr>
+      <w:r>
+        <w:t xml:space="preserve">Figura </w:t>
+      </w:r>
+      <w:fldSimple w:instr=" SEQ Figura \* ARABIC ">
+        <w:r>
+          <w:rPr>
+            <w:noProof/>
+          </w:rPr>
+          <w:t>19</w:t>
+        </w:r>
+      </w:fldSimple>
+      <w:r>
+        <w:t>: Tela de Combate 5</w:t>
+      </w:r>
+    </w:p>
+    <w:p/>
+    <w:p/>
+    <w:p/>
+    <w:p/>
+    <w:p/>
+    <w:p/>
+    <w:p/>
+    <w:p/>
+    <w:p/>
+    <w:p/>
+    <w:p/>
+    <w:p/>
+    <w:p/>
     <w:p>
       <w:pPr>
         <w:pStyle w:val="Ttulo2"/>
@@ -14576,7 +14664,7 @@
       <w:bookmarkEnd w:id="90"/>
     </w:p>
     <w:p>
-      <w:hyperlink r:id="rId30" w:history="1">
+      <w:hyperlink r:id="rId31" w:history="1">
         <w:r>
           <w:rPr>
             <w:rStyle w:val="Hyperlink"/>
@@ -14586,7 +14674,7 @@
       </w:hyperlink>
     </w:p>
     <w:p>
-      <w:hyperlink r:id="rId31" w:history="1">
+      <w:hyperlink r:id="rId32" w:history="1">
         <w:r>
           <w:rPr>
             <w:rStyle w:val="Hyperlink"/>
@@ -14596,7 +14684,7 @@
       </w:hyperlink>
     </w:p>
     <w:p>
-      <w:hyperlink r:id="rId32" w:history="1">
+      <w:hyperlink r:id="rId33" w:history="1">
         <w:r>
           <w:rPr>
             <w:rStyle w:val="Hyperlink"/>
@@ -14607,7 +14695,7 @@
     </w:p>
     <w:p/>
     <w:p>
-      <w:hyperlink r:id="rId33" w:anchor="15-biblioteca-de-menus" w:history="1">
+      <w:hyperlink r:id="rId34" w:anchor="15-biblioteca-de-menus" w:history="1">
         <w:r>
           <w:rPr>
             <w:rStyle w:val="Hyperlink"/>
@@ -14617,7 +14705,7 @@
       </w:hyperlink>
     </w:p>
     <w:p>
-      <w:hyperlink r:id="rId34" w:history="1">
+      <w:hyperlink r:id="rId35" w:history="1">
         <w:r>
           <w:rPr>
             <w:rStyle w:val="Hyperlink"/>
@@ -14627,7 +14715,7 @@
       </w:hyperlink>
     </w:p>
     <w:p>
-      <w:hyperlink r:id="rId35" w:history="1">
+      <w:hyperlink r:id="rId36" w:history="1">
         <w:r>
           <w:rPr>
             <w:rStyle w:val="Hyperlink"/>
@@ -14637,7 +14725,7 @@
       </w:hyperlink>
     </w:p>
     <w:p>
-      <w:hyperlink r:id="rId36" w:history="1">
+      <w:hyperlink r:id="rId37" w:history="1">
         <w:r>
           <w:rPr>
             <w:rStyle w:val="Hyperlink"/>
@@ -14647,7 +14735,7 @@
       </w:hyperlink>
     </w:p>
     <w:p>
-      <w:hyperlink r:id="rId37" w:history="1">
+      <w:hyperlink r:id="rId38" w:history="1">
         <w:r>
           <w:rPr>
             <w:rStyle w:val="Hyperlink"/>
@@ -14782,7 +14870,7 @@
       <w:r>
         <w:t xml:space="preserve"> </w:t>
       </w:r>
-      <w:hyperlink r:id="rId38" w:history="1">
+      <w:hyperlink r:id="rId39" w:history="1">
         <w:r>
           <w:rPr>
             <w:rStyle w:val="Hyperlink"/>
@@ -14794,7 +14882,7 @@
       </w:hyperlink>
     </w:p>
     <w:sectPr>
-      <w:footerReference w:type="default" r:id="rId39"/>
+      <w:footerReference w:type="default" r:id="rId40"/>
       <w:type w:val="continuous"/>
       <w:pgSz w:w="11906" w:h="16838" w:code="9"/>
       <w:pgMar w:top="1418" w:right="1418" w:bottom="1418" w:left="1418" w:header="709" w:footer="709" w:gutter="0"/>
@@ -18791,6 +18879,7 @@
   <w:style w:type="character" w:default="1" w:styleId="Fontepargpadro">
     <w:name w:val="Default Paragraph Font"/>
     <w:uiPriority w:val="1"/>
+    <w:semiHidden/>
     <w:unhideWhenUsed/>
   </w:style>
   <w:style w:type="table" w:default="1" w:styleId="Tabelanormal">
@@ -19875,10 +19964,6 @@
 </file>
 
 <file path=customXml/item1.xml><?xml version="1.0" encoding="utf-8"?>
-<b:Sources xmlns:b="http://schemas.openxmlformats.org/officeDocument/2006/bibliography" xmlns="http://schemas.openxmlformats.org/officeDocument/2006/bibliography" SelectedStyle="\APASixthEditionOfficeOnline.xsl" StyleName="APA" Version="6"/>
-</file>
-
-<file path=customXml/item2.xml><?xml version="1.0" encoding="utf-8"?>
 <ct:contentTypeSchema xmlns:ct="http://schemas.microsoft.com/office/2006/metadata/contentType" xmlns:ma="http://schemas.microsoft.com/office/2006/metadata/properties/metaAttributes" ct:_="" ma:_="" ma:contentTypeName="Documento" ma:contentTypeID="0x0101000C51F6162988D441A5E229627D84AB48" ma:contentTypeVersion="3" ma:contentTypeDescription="Crie um novo documento." ma:contentTypeScope="" ma:versionID="b3596a273bb9cfa3610e5ff4b41efe64">
   <xsd:schema xmlns:xsd="http://www.w3.org/2001/XMLSchema" xmlns:xs="http://www.w3.org/2001/XMLSchema" xmlns:p="http://schemas.microsoft.com/office/2006/metadata/properties" xmlns:ns2="cf695a09-ef12-4d5b-94b3-808302968d8a" targetNamespace="http://schemas.microsoft.com/office/2006/metadata/properties" ma:root="true" ma:fieldsID="b66cf92321b24bc0a477b724dcc68153" ns2:_="">
     <xsd:import namespace="cf695a09-ef12-4d5b-94b3-808302968d8a"/>
@@ -20016,13 +20101,11 @@
 </ct:contentTypeSchema>
 </file>
 
-<file path=customXml/item3.xml><?xml version="1.0" encoding="utf-8"?>
-<p:properties xmlns:p="http://schemas.microsoft.com/office/2006/metadata/properties" xmlns:xsi="http://www.w3.org/2001/XMLSchema-instance" xmlns:pc="http://schemas.microsoft.com/office/infopath/2007/PartnerControls">
-  <documentManagement/>
-</p:properties>
+<file path=customXml/item2.xml><?xml version="1.0" encoding="utf-8"?>
+<b:Sources xmlns:b="http://schemas.openxmlformats.org/officeDocument/2006/bibliography" xmlns="http://schemas.openxmlformats.org/officeDocument/2006/bibliography" SelectedStyle="\APASixthEditionOfficeOnline.xsl" StyleName="APA" Version="6"/>
 </file>
 
-<file path=customXml/item4.xml><?xml version="1.0" encoding="utf-8"?>
+<file path=customXml/item3.xml><?xml version="1.0" encoding="utf-8"?>
 <?mso-contentType ?>
 <FormTemplates xmlns="http://schemas.microsoft.com/sharepoint/v3/contenttype/forms">
   <Display>DocumentLibraryForm</Display>
@@ -20031,15 +20114,13 @@
 </FormTemplates>
 </file>
 
-<file path=customXml/itemProps1.xml><?xml version="1.0" encoding="utf-8"?>
-<ds:datastoreItem xmlns:ds="http://schemas.openxmlformats.org/officeDocument/2006/customXml" ds:itemID="{6E226CAE-ECD0-40CC-A84E-84A545CF6223}">
-  <ds:schemaRefs>
-    <ds:schemaRef ds:uri="http://schemas.openxmlformats.org/officeDocument/2006/bibliography"/>
-  </ds:schemaRefs>
-</ds:datastoreItem>
+<file path=customXml/item4.xml><?xml version="1.0" encoding="utf-8"?>
+<p:properties xmlns:p="http://schemas.microsoft.com/office/2006/metadata/properties" xmlns:xsi="http://www.w3.org/2001/XMLSchema-instance" xmlns:pc="http://schemas.microsoft.com/office/infopath/2007/PartnerControls">
+  <documentManagement/>
+</p:properties>
 </file>
 
-<file path=customXml/itemProps2.xml><?xml version="1.0" encoding="utf-8"?>
+<file path=customXml/itemProps1.xml><?xml version="1.0" encoding="utf-8"?>
 <ds:datastoreItem xmlns:ds="http://schemas.openxmlformats.org/officeDocument/2006/customXml" ds:itemID="{157A3C07-2778-43FB-A4D9-9FAB522AB7A9}">
   <ds:schemaRefs>
     <ds:schemaRef ds:uri="http://schemas.microsoft.com/office/2006/metadata/contentType"/>
@@ -20057,19 +20138,27 @@
 </ds:datastoreItem>
 </file>
 
+<file path=customXml/itemProps2.xml><?xml version="1.0" encoding="utf-8"?>
+<ds:datastoreItem xmlns:ds="http://schemas.openxmlformats.org/officeDocument/2006/customXml" ds:itemID="{6E226CAE-ECD0-40CC-A84E-84A545CF6223}">
+  <ds:schemaRefs>
+    <ds:schemaRef ds:uri="http://schemas.openxmlformats.org/officeDocument/2006/bibliography"/>
+  </ds:schemaRefs>
+</ds:datastoreItem>
+</file>
+
 <file path=customXml/itemProps3.xml><?xml version="1.0" encoding="utf-8"?>
+<ds:datastoreItem xmlns:ds="http://schemas.openxmlformats.org/officeDocument/2006/customXml" ds:itemID="{262D1E62-07A2-4559-8888-EC58B3066028}">
+  <ds:schemaRefs>
+    <ds:schemaRef ds:uri="http://schemas.microsoft.com/sharepoint/v3/contenttype/forms"/>
+  </ds:schemaRefs>
+</ds:datastoreItem>
+</file>
+
+<file path=customXml/itemProps4.xml><?xml version="1.0" encoding="utf-8"?>
 <ds:datastoreItem xmlns:ds="http://schemas.openxmlformats.org/officeDocument/2006/customXml" ds:itemID="{0CD9AB3C-5B77-441A-AFA8-1EFEA80F6618}">
   <ds:schemaRefs>
     <ds:schemaRef ds:uri="http://schemas.microsoft.com/office/2006/metadata/properties"/>
     <ds:schemaRef ds:uri="http://schemas.microsoft.com/office/infopath/2007/PartnerControls"/>
   </ds:schemaRefs>
 </ds:datastoreItem>
-</file>
-
-<file path=customXml/itemProps4.xml><?xml version="1.0" encoding="utf-8"?>
-<ds:datastoreItem xmlns:ds="http://schemas.openxmlformats.org/officeDocument/2006/customXml" ds:itemID="{262D1E62-07A2-4559-8888-EC58B3066028}">
-  <ds:schemaRefs>
-    <ds:schemaRef ds:uri="http://schemas.microsoft.com/sharepoint/v3/contenttype/forms"/>
-  </ds:schemaRefs>
-</ds:datastoreItem>
 </file>
</xml_diff>